<commit_message>
docs: update 24/7 permanent deployment link to https://lakshya749.github.io/vaulty/
</commit_message>
<xml_diff>
--- a/COLLEGE_SUBMISSION_PACKAGE/02_PROJECT_REPORT_EDITABLE.docx
+++ b/COLLEGE_SUBMISSION_PACKAGE/02_PROJECT_REPORT_EDITABLE.docx
@@ -284,7 +284,7 @@
             <w:sz w:val="20"/>
             <w:szCs w:val="20"/>
           </w:rPr>
-          <w:t xml:space="preserve">https://github.com/lakshyasingh/vaulty</w:t>
+          <w:t xml:space="preserve">https://github.com/Lakshya749/vaulty</w:t>
         </w:r>
       </w:hyperlink>
     </w:p>
@@ -312,7 +312,7 @@
             <w:sz w:val="20"/>
             <w:szCs w:val="20"/>
           </w:rPr>
-          <w:t xml:space="preserve">https://confidential-municipality-venice-activated.trycloudflare.com</w:t>
+          <w:t xml:space="preserve">https://lakshya749.github.io/vaulty/</w:t>
         </w:r>
       </w:hyperlink>
     </w:p>
@@ -510,7 +510,7 @@
             <w:sz w:val="24"/>
             <w:szCs w:val="24"/>
           </w:rPr>
-          <w:t xml:space="preserve">https://github.com/lakshyasingh/vaulty</w:t>
+          <w:t xml:space="preserve">https://github.com/Lakshya749/vaulty</w:t>
         </w:r>
       </w:hyperlink>
     </w:p>
@@ -538,7 +538,7 @@
             <w:sz w:val="24"/>
             <w:szCs w:val="24"/>
           </w:rPr>
-          <w:t xml:space="preserve">https://confidential-municipality-venice-activated.trycloudflare.com</w:t>
+          <w:t xml:space="preserve">https://lakshya749.github.io/vaulty/</w:t>
         </w:r>
       </w:hyperlink>
     </w:p>

</xml_diff>